<commit_message>
Updated data center resume for google
</commit_message>
<xml_diff>
--- a/Resume_RDP.docx
+++ b/Resume_RDP.docx
@@ -325,7 +325,7 @@
       </w:pPr>
       <w:r>
         <w:drawing>
-          <wp:inline wp14:editId="2667E1FC" wp14:anchorId="3001A88D">
+          <wp:inline wp14:editId="5B32DF03" wp14:anchorId="3001A88D">
             <wp:extent cx="237490" cy="237490"/>
             <wp:effectExtent l="0" t="0" r="0" b="0"/>
             <wp:docPr id="2" name="Picture 2" title=""/>
@@ -340,7 +340,7 @@
                     <pic:cNvPicPr/>
                   </pic:nvPicPr>
                   <pic:blipFill>
-                    <a:blip r:embed="R4568bc30775f4d02">
+                    <a:blip r:embed="Rb4cd9958cb8043f7">
                       <a:extLst xmlns:a="http://schemas.openxmlformats.org/drawingml/2006/main">
                         <a:ext uri="{28A0092B-C50C-407E-A947-70E740481C1C}">
                           <a14:useLocalDpi xmlns:a14="http://schemas.microsoft.com/office/drawing/2010/main" val="0"/>
@@ -398,14 +398,15 @@
         </w:numPr>
         <w:rPr>
           <w:rFonts w:ascii="Calibri" w:hAnsi="Calibri" w:eastAsia="Calibri" w:cs="Calibri" w:asciiTheme="minorAscii" w:hAnsiTheme="minorAscii" w:eastAsiaTheme="minorAscii" w:cstheme="minorAscii"/>
-          <w:color w:val="000000" w:themeColor="text1" w:themeTint="FF" w:themeShade="FF"/>
-          <w:sz w:val="22"/>
-          <w:szCs w:val="22"/>
-        </w:rPr>
-      </w:pPr>
-      <w:r>
-        <w:rPr>
-          <w:rFonts w:ascii="Calibri" w:hAnsi="Calibri" w:eastAsia="Calibri" w:cs="Calibri" w:asciiTheme="minorAscii" w:hAnsiTheme="minorAscii" w:eastAsiaTheme="minorAscii" w:cstheme="minorAscii"/>
+          <w:sz w:val="22"/>
+          <w:szCs w:val="22"/>
+        </w:rPr>
+      </w:pPr>
+      <w:r>
+        <w:rPr>
+          <w:rFonts w:ascii="Calibri" w:hAnsi="Calibri" w:eastAsia="Calibri" w:cs="Calibri" w:asciiTheme="minorAscii" w:hAnsiTheme="minorAscii" w:eastAsiaTheme="minorAscii" w:cstheme="minorAscii"/>
+          <w:b w:val="1"/>
+          <w:bCs w:val="1"/>
           <w:sz w:val="22"/>
           <w:szCs w:val="22"/>
         </w:rPr>
@@ -433,7 +434,23 @@
           <w:sz w:val="22"/>
           <w:szCs w:val="22"/>
         </w:rPr>
-        <w:t>of experience in designing of</w:t>
+        <w:t xml:space="preserve">of </w:t>
+      </w:r>
+      <w:r>
+        <w:rPr>
+          <w:rFonts w:ascii="Calibri" w:hAnsi="Calibri" w:eastAsia="Calibri" w:cs="Calibri" w:asciiTheme="minorAscii" w:hAnsiTheme="minorAscii" w:eastAsiaTheme="minorAscii" w:cstheme="minorAscii"/>
+          <w:sz w:val="22"/>
+          <w:szCs w:val="22"/>
+        </w:rPr>
+        <w:t xml:space="preserve">project management </w:t>
+      </w:r>
+      <w:r>
+        <w:rPr>
+          <w:rFonts w:ascii="Calibri" w:hAnsi="Calibri" w:eastAsia="Calibri" w:cs="Calibri" w:asciiTheme="minorAscii" w:hAnsiTheme="minorAscii" w:eastAsiaTheme="minorAscii" w:cstheme="minorAscii"/>
+          <w:sz w:val="22"/>
+          <w:szCs w:val="22"/>
+        </w:rPr>
+        <w:t>experience in designing of</w:t>
       </w:r>
       <w:r>
         <w:rPr>
@@ -449,7 +466,23 @@
           <w:sz w:val="22"/>
           <w:szCs w:val="22"/>
         </w:rPr>
-        <w:t xml:space="preserve">Mechanical and Plumbing </w:t>
+        <w:t xml:space="preserve">Mechanical </w:t>
+      </w:r>
+      <w:r>
+        <w:rPr>
+          <w:rFonts w:ascii="Calibri" w:hAnsi="Calibri" w:eastAsia="Calibri" w:cs="Calibri" w:asciiTheme="minorAscii" w:hAnsiTheme="minorAscii" w:eastAsiaTheme="minorAscii" w:cstheme="minorAscii"/>
+          <w:sz w:val="22"/>
+          <w:szCs w:val="22"/>
+        </w:rPr>
+        <w:t xml:space="preserve">(HVAC) </w:t>
+      </w:r>
+      <w:r>
+        <w:rPr>
+          <w:rFonts w:ascii="Calibri" w:hAnsi="Calibri" w:eastAsia="Calibri" w:cs="Calibri" w:asciiTheme="minorAscii" w:hAnsiTheme="minorAscii" w:eastAsiaTheme="minorAscii" w:cstheme="minorAscii"/>
+          <w:sz w:val="22"/>
+          <w:szCs w:val="22"/>
+        </w:rPr>
+        <w:t xml:space="preserve">and Plumbing </w:t>
       </w:r>
       <w:r>
         <w:rPr>
@@ -465,7 +498,43 @@
           <w:sz w:val="22"/>
           <w:szCs w:val="22"/>
         </w:rPr>
-        <w:t xml:space="preserve"> for labs, healthcare, industrial, residential, and government projects.</w:t>
+        <w:t xml:space="preserve"> for </w:t>
+      </w:r>
+      <w:r>
+        <w:rPr>
+          <w:rFonts w:ascii="Calibri" w:hAnsi="Calibri" w:eastAsia="Calibri" w:cs="Calibri" w:asciiTheme="minorAscii" w:hAnsiTheme="minorAscii" w:eastAsiaTheme="minorAscii" w:cstheme="minorAscii"/>
+          <w:b w:val="1"/>
+          <w:bCs w:val="1"/>
+          <w:sz w:val="22"/>
+          <w:szCs w:val="22"/>
+        </w:rPr>
+        <w:t xml:space="preserve">high density </w:t>
+      </w:r>
+      <w:r>
+        <w:rPr>
+          <w:rFonts w:ascii="Calibri" w:hAnsi="Calibri" w:eastAsia="Calibri" w:cs="Calibri" w:asciiTheme="minorAscii" w:hAnsiTheme="minorAscii" w:eastAsiaTheme="minorAscii" w:cstheme="minorAscii"/>
+          <w:b w:val="1"/>
+          <w:bCs w:val="1"/>
+          <w:sz w:val="22"/>
+          <w:szCs w:val="22"/>
+        </w:rPr>
+        <w:t>Server rooms</w:t>
+      </w:r>
+      <w:r>
+        <w:rPr>
+          <w:rFonts w:ascii="Calibri" w:hAnsi="Calibri" w:eastAsia="Calibri" w:cs="Calibri" w:asciiTheme="minorAscii" w:hAnsiTheme="minorAscii" w:eastAsiaTheme="minorAscii" w:cstheme="minorAscii"/>
+          <w:sz w:val="22"/>
+          <w:szCs w:val="22"/>
+        </w:rPr>
+        <w:t>, Labs and Industrial Occupancies</w:t>
+      </w:r>
+      <w:r>
+        <w:rPr>
+          <w:rFonts w:ascii="Calibri" w:hAnsi="Calibri" w:eastAsia="Calibri" w:cs="Calibri" w:asciiTheme="minorAscii" w:hAnsiTheme="minorAscii" w:eastAsiaTheme="minorAscii" w:cstheme="minorAscii"/>
+          <w:sz w:val="22"/>
+          <w:szCs w:val="22"/>
+        </w:rPr>
+        <w:t>.</w:t>
       </w:r>
     </w:p>
     <w:p>
@@ -477,26 +546,53 @@
         </w:numPr>
         <w:rPr>
           <w:rFonts w:ascii="Calibri" w:hAnsi="Calibri" w:eastAsia="Calibri" w:cs="Calibri" w:asciiTheme="minorAscii" w:hAnsiTheme="minorAscii" w:eastAsiaTheme="minorAscii" w:cstheme="minorAscii"/>
-          <w:color w:val="000000" w:themeColor="text1" w:themeTint="FF" w:themeShade="FF"/>
-          <w:sz w:val="22"/>
-          <w:szCs w:val="22"/>
-        </w:rPr>
-      </w:pPr>
-      <w:r>
-        <w:rPr>
-          <w:rFonts w:ascii="Calibri" w:hAnsi="Calibri" w:eastAsia="Calibri" w:cs="Calibri" w:asciiTheme="minorAscii" w:hAnsiTheme="minorAscii" w:eastAsiaTheme="minorAscii" w:cstheme="minorAscii"/>
-          <w:sz w:val="22"/>
-          <w:szCs w:val="22"/>
-        </w:rPr>
-        <w:t xml:space="preserve">Proficient </w:t>
-      </w:r>
-      <w:r>
-        <w:rPr>
-          <w:rFonts w:ascii="Calibri" w:hAnsi="Calibri" w:eastAsia="Calibri" w:cs="Calibri" w:asciiTheme="minorAscii" w:hAnsiTheme="minorAscii" w:eastAsiaTheme="minorAscii" w:cstheme="minorAscii"/>
-          <w:sz w:val="22"/>
-          <w:szCs w:val="22"/>
-        </w:rPr>
-        <w:t>in using</w:t>
+          <w:noProof w:val="0"/>
+          <w:sz w:val="22"/>
+          <w:szCs w:val="22"/>
+          <w:lang w:val="en-IN"/>
+        </w:rPr>
+      </w:pPr>
+      <w:r>
+        <w:rPr>
+          <w:rFonts w:ascii="Calibri" w:hAnsi="Calibri" w:eastAsia="Calibri" w:cs="Calibri"/>
+          <w:noProof w:val="0"/>
+          <w:sz w:val="22"/>
+          <w:szCs w:val="22"/>
+          <w:lang w:val="en-IN"/>
+        </w:rPr>
+        <w:t>Deep understanding of geometric dimensioning and tolerancing (</w:t>
+      </w:r>
+      <w:r>
+        <w:rPr>
+          <w:rFonts w:ascii="Calibri" w:hAnsi="Calibri" w:eastAsia="Calibri" w:cs="Calibri"/>
+          <w:b w:val="1"/>
+          <w:bCs w:val="1"/>
+          <w:noProof w:val="0"/>
+          <w:sz w:val="22"/>
+          <w:szCs w:val="22"/>
+          <w:lang w:val="en-IN"/>
+        </w:rPr>
+        <w:t>GD&amp;T</w:t>
+      </w:r>
+      <w:r>
+        <w:rPr>
+          <w:rFonts w:ascii="Calibri" w:hAnsi="Calibri" w:eastAsia="Calibri" w:cs="Calibri"/>
+          <w:noProof w:val="0"/>
+          <w:sz w:val="22"/>
+          <w:szCs w:val="22"/>
+          <w:lang w:val="en-IN"/>
+        </w:rPr>
+        <w:t>) principles</w:t>
+      </w:r>
+      <w:r>
+        <w:rPr>
+          <w:rFonts w:ascii="Calibri" w:hAnsi="Calibri" w:eastAsia="Calibri" w:cs="Calibri" w:asciiTheme="minorAscii" w:hAnsiTheme="minorAscii" w:eastAsiaTheme="minorAscii" w:cstheme="minorAscii"/>
+          <w:noProof w:val="0"/>
+          <w:sz w:val="22"/>
+          <w:szCs w:val="22"/>
+          <w:lang w:val="en-IN"/>
+        </w:rPr>
+        <w:t>.</w:t>
       </w:r>
       <w:r>
         <w:rPr>
@@ -506,40 +602,8 @@
         </w:rPr>
         <w:t xml:space="preserve"> </w:t>
       </w:r>
-      <w:r>
-        <w:rPr>
-          <w:rFonts w:ascii="Calibri" w:hAnsi="Calibri" w:eastAsia="Calibri" w:cs="Calibri" w:asciiTheme="minorAscii" w:hAnsiTheme="minorAscii" w:eastAsiaTheme="minorAscii" w:cstheme="minorAscii"/>
-          <w:sz w:val="22"/>
-          <w:szCs w:val="22"/>
-        </w:rPr>
-        <w:t>REVIT &amp;</w:t>
-      </w:r>
-      <w:r>
-        <w:rPr>
-          <w:rFonts w:ascii="Calibri" w:hAnsi="Calibri" w:eastAsia="Calibri" w:cs="Calibri" w:asciiTheme="minorAscii" w:hAnsiTheme="minorAscii" w:eastAsiaTheme="minorAscii" w:cstheme="minorAscii"/>
-          <w:sz w:val="22"/>
-          <w:szCs w:val="22"/>
-        </w:rPr>
-        <w:t xml:space="preserve"> AutoCAD</w:t>
-      </w:r>
-      <w:r>
-        <w:rPr>
-          <w:rFonts w:ascii="Calibri" w:hAnsi="Calibri" w:eastAsia="Calibri" w:cs="Calibri" w:asciiTheme="minorAscii" w:hAnsiTheme="minorAscii" w:eastAsiaTheme="minorAscii" w:cstheme="minorAscii"/>
-          <w:sz w:val="22"/>
-          <w:szCs w:val="22"/>
-        </w:rPr>
-        <w:t>.</w:t>
-      </w:r>
-      <w:r>
-        <w:rPr>
-          <w:rFonts w:ascii="Calibri" w:hAnsi="Calibri" w:eastAsia="Calibri" w:cs="Calibri" w:asciiTheme="minorAscii" w:hAnsiTheme="minorAscii" w:eastAsiaTheme="minorAscii" w:cstheme="minorAscii"/>
-          <w:sz w:val="22"/>
-          <w:szCs w:val="22"/>
-        </w:rPr>
-        <w:t xml:space="preserve"> Deep understanding of Revit parameters, element categories, and advanced workflows like automated pipe and duct sizing.</w:t>
-      </w:r>
     </w:p>
-    <w:p w14:noSpellErr="1">
+    <w:p>
       <w:pPr>
         <w:pStyle w:val="NoSpacing"/>
         <w:numPr>
@@ -548,34 +612,33 @@
         </w:numPr>
         <w:rPr>
           <w:rFonts w:ascii="Calibri" w:hAnsi="Calibri" w:eastAsia="Calibri" w:cs="Calibri" w:asciiTheme="minorAscii" w:hAnsiTheme="minorAscii" w:eastAsiaTheme="minorAscii" w:cstheme="minorAscii"/>
-          <w:color w:val="000000" w:themeColor="text1" w:themeTint="FF" w:themeShade="FF"/>
-          <w:sz w:val="22"/>
-          <w:szCs w:val="22"/>
-        </w:rPr>
-      </w:pPr>
-      <w:r>
-        <w:rPr>
-          <w:rFonts w:ascii="Calibri" w:hAnsi="Calibri" w:eastAsia="Calibri" w:cs="Calibri" w:asciiTheme="minorAscii" w:hAnsiTheme="minorAscii" w:eastAsiaTheme="minorAscii" w:cstheme="minorAscii"/>
-          <w:sz w:val="22"/>
-          <w:szCs w:val="22"/>
-        </w:rPr>
-        <w:t>K</w:t>
-      </w:r>
-      <w:r>
-        <w:rPr>
-          <w:rFonts w:ascii="Calibri" w:hAnsi="Calibri" w:eastAsia="Calibri" w:cs="Calibri" w:asciiTheme="minorAscii" w:hAnsiTheme="minorAscii" w:eastAsiaTheme="minorAscii" w:cstheme="minorAscii"/>
-          <w:sz w:val="22"/>
-          <w:szCs w:val="22"/>
-        </w:rPr>
-        <w:t>nowledge</w:t>
-      </w:r>
-      <w:r>
-        <w:rPr>
-          <w:rFonts w:ascii="Calibri" w:hAnsi="Calibri" w:eastAsia="Calibri" w:cs="Calibri" w:asciiTheme="minorAscii" w:hAnsiTheme="minorAscii" w:eastAsiaTheme="minorAscii" w:cstheme="minorAscii"/>
-          <w:sz w:val="22"/>
-          <w:szCs w:val="22"/>
-        </w:rPr>
-        <w:t>able in</w:t>
+          <w:sz w:val="22"/>
+          <w:szCs w:val="22"/>
+        </w:rPr>
+      </w:pPr>
+      <w:r>
+        <w:rPr>
+          <w:rFonts w:ascii="Calibri" w:hAnsi="Calibri" w:eastAsia="Calibri" w:cs="Calibri" w:asciiTheme="minorAscii" w:hAnsiTheme="minorAscii" w:eastAsiaTheme="minorAscii" w:cstheme="minorAscii"/>
+          <w:sz w:val="22"/>
+          <w:szCs w:val="22"/>
+        </w:rPr>
+        <w:t xml:space="preserve">Proficient </w:t>
+      </w:r>
+      <w:r>
+        <w:rPr>
+          <w:rFonts w:ascii="Calibri" w:hAnsi="Calibri" w:eastAsia="Calibri" w:cs="Calibri" w:asciiTheme="minorAscii" w:hAnsiTheme="minorAscii" w:eastAsiaTheme="minorAscii" w:cstheme="minorAscii"/>
+          <w:sz w:val="22"/>
+          <w:szCs w:val="22"/>
+        </w:rPr>
+        <w:t>in using</w:t>
+      </w:r>
+      <w:r>
+        <w:rPr>
+          <w:rFonts w:ascii="Calibri" w:hAnsi="Calibri" w:eastAsia="Calibri" w:cs="Calibri" w:asciiTheme="minorAscii" w:hAnsiTheme="minorAscii" w:eastAsiaTheme="minorAscii" w:cstheme="minorAscii"/>
+          <w:sz w:val="22"/>
+          <w:szCs w:val="22"/>
+        </w:rPr>
+        <w:t xml:space="preserve"> CAD software such as</w:t>
       </w:r>
       <w:r>
         <w:rPr>
@@ -588,34 +651,42 @@
       <w:r>
         <w:rPr>
           <w:rFonts w:ascii="Calibri" w:hAnsi="Calibri" w:eastAsia="Calibri" w:cs="Calibri" w:asciiTheme="minorAscii" w:hAnsiTheme="minorAscii" w:eastAsiaTheme="minorAscii" w:cstheme="minorAscii"/>
-          <w:sz w:val="22"/>
-          <w:szCs w:val="22"/>
-        </w:rPr>
-        <w:t>Mechanical Code</w:t>
-      </w:r>
-      <w:r>
-        <w:rPr>
-          <w:rFonts w:ascii="Calibri" w:hAnsi="Calibri" w:eastAsia="Calibri" w:cs="Calibri" w:asciiTheme="minorAscii" w:hAnsiTheme="minorAscii" w:eastAsiaTheme="minorAscii" w:cstheme="minorAscii"/>
-          <w:sz w:val="22"/>
-          <w:szCs w:val="22"/>
-        </w:rPr>
-        <w:t>s</w:t>
-      </w:r>
-      <w:r>
-        <w:rPr>
-          <w:rFonts w:ascii="Calibri" w:hAnsi="Calibri" w:eastAsia="Calibri" w:cs="Calibri" w:asciiTheme="minorAscii" w:hAnsiTheme="minorAscii" w:eastAsiaTheme="minorAscii" w:cstheme="minorAscii"/>
-          <w:sz w:val="22"/>
-          <w:szCs w:val="22"/>
-        </w:rPr>
-        <w:t>,</w:t>
-      </w:r>
-      <w:r>
-        <w:rPr>
-          <w:rFonts w:ascii="Calibri" w:hAnsi="Calibri" w:eastAsia="Calibri" w:cs="Calibri" w:asciiTheme="minorAscii" w:hAnsiTheme="minorAscii" w:eastAsiaTheme="minorAscii" w:cstheme="minorAscii"/>
-          <w:sz w:val="22"/>
-          <w:szCs w:val="22"/>
-        </w:rPr>
-        <w:t xml:space="preserve"> Plumbing codes, ASHRAE standards and ASPE Guidelines</w:t>
+          <w:b w:val="1"/>
+          <w:bCs w:val="1"/>
+          <w:sz w:val="22"/>
+          <w:szCs w:val="22"/>
+        </w:rPr>
+        <w:t>REVIT</w:t>
+      </w:r>
+      <w:r>
+        <w:rPr>
+          <w:rFonts w:ascii="Calibri" w:hAnsi="Calibri" w:eastAsia="Calibri" w:cs="Calibri" w:asciiTheme="minorAscii" w:hAnsiTheme="minorAscii" w:eastAsiaTheme="minorAscii" w:cstheme="minorAscii"/>
+          <w:b w:val="1"/>
+          <w:bCs w:val="1"/>
+          <w:sz w:val="22"/>
+          <w:szCs w:val="22"/>
+        </w:rPr>
+        <w:t>, Ansys and</w:t>
+      </w:r>
+      <w:r>
+        <w:rPr>
+          <w:rFonts w:ascii="Calibri" w:hAnsi="Calibri" w:eastAsia="Calibri" w:cs="Calibri" w:asciiTheme="minorAscii" w:hAnsiTheme="minorAscii" w:eastAsiaTheme="minorAscii" w:cstheme="minorAscii"/>
+          <w:b w:val="1"/>
+          <w:bCs w:val="1"/>
+          <w:sz w:val="22"/>
+          <w:szCs w:val="22"/>
+        </w:rPr>
+        <w:t xml:space="preserve"> </w:t>
+      </w:r>
+      <w:r>
+        <w:rPr>
+          <w:rFonts w:ascii="Calibri" w:hAnsi="Calibri" w:eastAsia="Calibri" w:cs="Calibri" w:asciiTheme="minorAscii" w:hAnsiTheme="minorAscii" w:eastAsiaTheme="minorAscii" w:cstheme="minorAscii"/>
+          <w:b w:val="1"/>
+          <w:bCs w:val="1"/>
+          <w:sz w:val="22"/>
+          <w:szCs w:val="22"/>
+        </w:rPr>
+        <w:t>Creo</w:t>
       </w:r>
       <w:r>
         <w:rPr>
@@ -624,14 +695,6 @@
           <w:szCs w:val="22"/>
         </w:rPr>
         <w:t>.</w:t>
-      </w:r>
-      <w:r>
-        <w:rPr>
-          <w:rFonts w:ascii="Calibri" w:hAnsi="Calibri" w:eastAsia="Calibri" w:cs="Calibri" w:asciiTheme="minorAscii" w:hAnsiTheme="minorAscii" w:eastAsiaTheme="minorAscii" w:cstheme="minorAscii"/>
-          <w:sz w:val="22"/>
-          <w:szCs w:val="22"/>
-        </w:rPr>
-        <w:t xml:space="preserve">  </w:t>
       </w:r>
     </w:p>
     <w:p>
@@ -654,31 +717,79 @@
           <w:sz w:val="22"/>
           <w:szCs w:val="22"/>
         </w:rPr>
-        <w:t>Strong foundation</w:t>
-      </w:r>
-      <w:r>
-        <w:rPr>
-          <w:rFonts w:ascii="Calibri" w:hAnsi="Calibri" w:eastAsia="Calibri" w:cs="Calibri" w:asciiTheme="minorAscii" w:hAnsiTheme="minorAscii" w:eastAsiaTheme="minorAscii" w:cstheme="minorAscii"/>
-          <w:sz w:val="22"/>
-          <w:szCs w:val="22"/>
-        </w:rPr>
-        <w:t xml:space="preserve"> in Ps</w:t>
-      </w:r>
-      <w:r>
-        <w:rPr>
-          <w:rFonts w:ascii="Calibri" w:hAnsi="Calibri" w:eastAsia="Calibri" w:cs="Calibri" w:asciiTheme="minorAscii" w:hAnsiTheme="minorAscii" w:eastAsiaTheme="minorAscii" w:cstheme="minorAscii"/>
-          <w:sz w:val="22"/>
-          <w:szCs w:val="22"/>
-        </w:rPr>
-        <w:t>ychrometric charts, Fan/pump curves, Thermodynamics</w:t>
-      </w:r>
-      <w:r>
-        <w:rPr>
-          <w:rFonts w:ascii="Calibri" w:hAnsi="Calibri" w:eastAsia="Calibri" w:cs="Calibri" w:asciiTheme="minorAscii" w:hAnsiTheme="minorAscii" w:eastAsiaTheme="minorAscii" w:cstheme="minorAscii"/>
-          <w:sz w:val="22"/>
-          <w:szCs w:val="22"/>
-        </w:rPr>
-        <w:t>, Fluid Mechanics</w:t>
+        <w:t>K</w:t>
+      </w:r>
+      <w:r>
+        <w:rPr>
+          <w:rFonts w:ascii="Calibri" w:hAnsi="Calibri" w:eastAsia="Calibri" w:cs="Calibri" w:asciiTheme="minorAscii" w:hAnsiTheme="minorAscii" w:eastAsiaTheme="minorAscii" w:cstheme="minorAscii"/>
+          <w:sz w:val="22"/>
+          <w:szCs w:val="22"/>
+        </w:rPr>
+        <w:t>nowledge</w:t>
+      </w:r>
+      <w:r>
+        <w:rPr>
+          <w:rFonts w:ascii="Calibri" w:hAnsi="Calibri" w:eastAsia="Calibri" w:cs="Calibri" w:asciiTheme="minorAscii" w:hAnsiTheme="minorAscii" w:eastAsiaTheme="minorAscii" w:cstheme="minorAscii"/>
+          <w:sz w:val="22"/>
+          <w:szCs w:val="22"/>
+        </w:rPr>
+        <w:t>able in</w:t>
+      </w:r>
+      <w:r>
+        <w:rPr>
+          <w:rFonts w:ascii="Calibri" w:hAnsi="Calibri" w:eastAsia="Calibri" w:cs="Calibri" w:asciiTheme="minorAscii" w:hAnsiTheme="minorAscii" w:eastAsiaTheme="minorAscii" w:cstheme="minorAscii"/>
+          <w:sz w:val="22"/>
+          <w:szCs w:val="22"/>
+        </w:rPr>
+        <w:t xml:space="preserve"> </w:t>
+      </w:r>
+      <w:r>
+        <w:rPr>
+          <w:rFonts w:ascii="Calibri" w:hAnsi="Calibri" w:eastAsia="Calibri" w:cs="Calibri" w:asciiTheme="minorAscii" w:hAnsiTheme="minorAscii" w:eastAsiaTheme="minorAscii" w:cstheme="minorAscii"/>
+          <w:sz w:val="22"/>
+          <w:szCs w:val="22"/>
+        </w:rPr>
+        <w:t>Mechanical Code</w:t>
+      </w:r>
+      <w:r>
+        <w:rPr>
+          <w:rFonts w:ascii="Calibri" w:hAnsi="Calibri" w:eastAsia="Calibri" w:cs="Calibri" w:asciiTheme="minorAscii" w:hAnsiTheme="minorAscii" w:eastAsiaTheme="minorAscii" w:cstheme="minorAscii"/>
+          <w:sz w:val="22"/>
+          <w:szCs w:val="22"/>
+        </w:rPr>
+        <w:t>s</w:t>
+      </w:r>
+      <w:r>
+        <w:rPr>
+          <w:rFonts w:ascii="Calibri" w:hAnsi="Calibri" w:eastAsia="Calibri" w:cs="Calibri" w:asciiTheme="minorAscii" w:hAnsiTheme="minorAscii" w:eastAsiaTheme="minorAscii" w:cstheme="minorAscii"/>
+          <w:sz w:val="22"/>
+          <w:szCs w:val="22"/>
+        </w:rPr>
+        <w:t>,</w:t>
+      </w:r>
+      <w:r>
+        <w:rPr>
+          <w:rFonts w:ascii="Calibri" w:hAnsi="Calibri" w:eastAsia="Calibri" w:cs="Calibri" w:asciiTheme="minorAscii" w:hAnsiTheme="minorAscii" w:eastAsiaTheme="minorAscii" w:cstheme="minorAscii"/>
+          <w:sz w:val="22"/>
+          <w:szCs w:val="22"/>
+        </w:rPr>
+        <w:t xml:space="preserve"> Plumbing codes,</w:t>
+      </w:r>
+      <w:r>
+        <w:rPr>
+          <w:rFonts w:ascii="Calibri" w:hAnsi="Calibri" w:eastAsia="Calibri" w:cs="Calibri" w:asciiTheme="minorAscii" w:hAnsiTheme="minorAscii" w:eastAsiaTheme="minorAscii" w:cstheme="minorAscii"/>
+          <w:sz w:val="22"/>
+          <w:szCs w:val="22"/>
+        </w:rPr>
+        <w:t xml:space="preserve"> NFPA,</w:t>
+      </w:r>
+      <w:r>
+        <w:rPr>
+          <w:rFonts w:ascii="Calibri" w:hAnsi="Calibri" w:eastAsia="Calibri" w:cs="Calibri" w:asciiTheme="minorAscii" w:hAnsiTheme="minorAscii" w:eastAsiaTheme="minorAscii" w:cstheme="minorAscii"/>
+          <w:sz w:val="22"/>
+          <w:szCs w:val="22"/>
+        </w:rPr>
+        <w:t xml:space="preserve"> ASHRAE standards and ASPE Guidelines</w:t>
       </w:r>
       <w:r>
         <w:rPr>
@@ -687,6 +798,14 @@
           <w:szCs w:val="22"/>
         </w:rPr>
         <w:t>.</w:t>
+      </w:r>
+      <w:r>
+        <w:rPr>
+          <w:rFonts w:ascii="Calibri" w:hAnsi="Calibri" w:eastAsia="Calibri" w:cs="Calibri" w:asciiTheme="minorAscii" w:hAnsiTheme="minorAscii" w:eastAsiaTheme="minorAscii" w:cstheme="minorAscii"/>
+          <w:sz w:val="22"/>
+          <w:szCs w:val="22"/>
+        </w:rPr>
+        <w:t xml:space="preserve">  </w:t>
       </w:r>
     </w:p>
     <w:p>
@@ -706,20 +825,64 @@
       <w:r>
         <w:rPr>
           <w:rFonts w:ascii="Calibri" w:hAnsi="Calibri" w:eastAsia="Calibri" w:cs="Calibri" w:asciiTheme="minorAscii" w:hAnsiTheme="minorAscii" w:eastAsiaTheme="minorAscii" w:cstheme="minorAscii"/>
-          <w:noProof w:val="0"/>
-          <w:sz w:val="22"/>
-          <w:szCs w:val="22"/>
-          <w:lang w:val="en-IN"/>
-        </w:rPr>
-        <w:t>Extremely motivated team player, consistently improving processes and taking full responsibility for work</w:t>
-      </w:r>
-      <w:r>
-        <w:rPr>
-          <w:rFonts w:ascii="Calibri" w:hAnsi="Calibri" w:eastAsia="Calibri" w:cs="Calibri" w:asciiTheme="minorAscii" w:hAnsiTheme="minorAscii" w:eastAsiaTheme="minorAscii" w:cstheme="minorAscii"/>
-          <w:noProof w:val="0"/>
-          <w:sz w:val="22"/>
-          <w:szCs w:val="22"/>
-          <w:lang w:val="en-IN"/>
+          <w:sz w:val="22"/>
+          <w:szCs w:val="22"/>
+        </w:rPr>
+        <w:t>Strong foundation</w:t>
+      </w:r>
+      <w:r>
+        <w:rPr>
+          <w:rFonts w:ascii="Calibri" w:hAnsi="Calibri" w:eastAsia="Calibri" w:cs="Calibri" w:asciiTheme="minorAscii" w:hAnsiTheme="minorAscii" w:eastAsiaTheme="minorAscii" w:cstheme="minorAscii"/>
+          <w:sz w:val="22"/>
+          <w:szCs w:val="22"/>
+        </w:rPr>
+        <w:t xml:space="preserve"> in </w:t>
+      </w:r>
+      <w:r>
+        <w:rPr>
+          <w:rFonts w:ascii="Calibri" w:hAnsi="Calibri" w:eastAsia="Calibri" w:cs="Calibri" w:asciiTheme="minorAscii" w:hAnsiTheme="minorAscii" w:eastAsiaTheme="minorAscii" w:cstheme="minorAscii"/>
+          <w:b w:val="1"/>
+          <w:bCs w:val="1"/>
+          <w:sz w:val="22"/>
+          <w:szCs w:val="22"/>
+        </w:rPr>
+        <w:t>Ps</w:t>
+      </w:r>
+      <w:r>
+        <w:rPr>
+          <w:rFonts w:ascii="Calibri" w:hAnsi="Calibri" w:eastAsia="Calibri" w:cs="Calibri" w:asciiTheme="minorAscii" w:hAnsiTheme="minorAscii" w:eastAsiaTheme="minorAscii" w:cstheme="minorAscii"/>
+          <w:b w:val="1"/>
+          <w:bCs w:val="1"/>
+          <w:sz w:val="22"/>
+          <w:szCs w:val="22"/>
+        </w:rPr>
+        <w:t>ychrometric charts, Thermodynamics</w:t>
+      </w:r>
+      <w:r>
+        <w:rPr>
+          <w:rFonts w:ascii="Calibri" w:hAnsi="Calibri" w:eastAsia="Calibri" w:cs="Calibri" w:asciiTheme="minorAscii" w:hAnsiTheme="minorAscii" w:eastAsiaTheme="minorAscii" w:cstheme="minorAscii"/>
+          <w:b w:val="1"/>
+          <w:bCs w:val="1"/>
+          <w:sz w:val="22"/>
+          <w:szCs w:val="22"/>
+        </w:rPr>
+        <w:t>, Fluid Mechanics</w:t>
+      </w:r>
+      <w:r>
+        <w:rPr>
+          <w:rFonts w:ascii="Calibri" w:hAnsi="Calibri" w:eastAsia="Calibri" w:cs="Calibri" w:asciiTheme="minorAscii" w:hAnsiTheme="minorAscii" w:eastAsiaTheme="minorAscii" w:cstheme="minorAscii"/>
+          <w:b w:val="1"/>
+          <w:bCs w:val="1"/>
+          <w:sz w:val="22"/>
+          <w:szCs w:val="22"/>
+        </w:rPr>
+        <w:t>, Machine Design, Heat transfer</w:t>
+      </w:r>
+      <w:r>
+        <w:rPr>
+          <w:rFonts w:ascii="Calibri" w:hAnsi="Calibri" w:eastAsia="Calibri" w:cs="Calibri" w:asciiTheme="minorAscii" w:hAnsiTheme="minorAscii" w:eastAsiaTheme="minorAscii" w:cstheme="minorAscii"/>
+          <w:sz w:val="22"/>
+          <w:szCs w:val="22"/>
         </w:rPr>
         <w:t>.</w:t>
       </w:r>
@@ -970,7 +1133,7 @@
         <w:t xml:space="preserve"> – PRESENT</w:t>
       </w:r>
     </w:p>
-    <w:p w14:noSpellErr="1">
+    <w:p>
       <w:pPr>
         <w:pStyle w:val="NoSpacing"/>
         <w:numPr>
@@ -1003,7 +1166,7 @@
           <w:szCs w:val="22"/>
           <w:u w:val="none"/>
         </w:rPr>
-        <w:t>Laboratories, Healthcare, Industrial</w:t>
+        <w:t xml:space="preserve">Server Rooms, </w:t>
       </w:r>
       <w:r>
         <w:rPr>
@@ -1015,7 +1178,31 @@
           <w:szCs w:val="22"/>
           <w:u w:val="none"/>
         </w:rPr>
-        <w:t xml:space="preserve"> and</w:t>
+        <w:t>Laboratories</w:t>
+      </w:r>
+      <w:r>
+        <w:rPr>
+          <w:rFonts w:ascii="Calibri" w:hAnsi="Calibri" w:cs="Calibri" w:asciiTheme="minorAscii" w:hAnsiTheme="minorAscii" w:cstheme="minorAscii"/>
+          <w:b w:val="1"/>
+          <w:bCs w:val="1"/>
+          <w:color w:val="000000" w:themeColor="text1" w:themeTint="FF" w:themeShade="FF"/>
+          <w:sz w:val="22"/>
+          <w:szCs w:val="22"/>
+          <w:u w:val="none"/>
+        </w:rPr>
+        <w:t xml:space="preserve"> </w:t>
+      </w:r>
+      <w:r>
+        <w:rPr>
+          <w:rFonts w:ascii="Calibri" w:hAnsi="Calibri" w:cs="Calibri" w:asciiTheme="minorAscii" w:hAnsiTheme="minorAscii" w:cstheme="minorAscii"/>
+          <w:b w:val="1"/>
+          <w:bCs w:val="1"/>
+          <w:color w:val="000000" w:themeColor="text1" w:themeTint="FF" w:themeShade="FF"/>
+          <w:sz w:val="22"/>
+          <w:szCs w:val="22"/>
+          <w:u w:val="none"/>
+        </w:rPr>
+        <w:t>and</w:t>
       </w:r>
       <w:r>
         <w:rPr>
@@ -1458,90 +1645,41 @@
         </w:numPr>
         <w:rPr>
           <w:rFonts w:ascii="Calibri" w:hAnsi="Calibri" w:eastAsia="Calibri" w:cs="Calibri" w:asciiTheme="minorAscii" w:hAnsiTheme="minorAscii" w:eastAsiaTheme="minorAscii" w:cstheme="minorAscii"/>
-          <w:color w:val="000000" w:themeColor="text1" w:themeTint="FF" w:themeShade="FF"/>
-          <w:sz w:val="22"/>
-          <w:szCs w:val="22"/>
-        </w:rPr>
-      </w:pPr>
-      <w:r>
-        <w:rPr>
-          <w:rFonts w:ascii="Calibri" w:hAnsi="Calibri" w:eastAsia="Calibri" w:cs="Calibri" w:asciiTheme="minorAscii" w:hAnsiTheme="minorAscii" w:eastAsiaTheme="minorAscii" w:cstheme="minorAscii"/>
-          <w:sz w:val="22"/>
-          <w:szCs w:val="22"/>
-        </w:rPr>
-        <w:t xml:space="preserve">Worked on </w:t>
-      </w:r>
-      <w:r>
-        <w:rPr>
-          <w:rFonts w:ascii="Calibri" w:hAnsi="Calibri" w:eastAsia="Calibri" w:cs="Calibri" w:asciiTheme="minorAscii" w:hAnsiTheme="minorAscii" w:eastAsiaTheme="minorAscii" w:cstheme="minorAscii"/>
-          <w:sz w:val="22"/>
-          <w:szCs w:val="22"/>
-        </w:rPr>
-        <w:t>4</w:t>
-      </w:r>
-      <w:r>
-        <w:rPr>
-          <w:rFonts w:ascii="Calibri" w:hAnsi="Calibri" w:eastAsia="Calibri" w:cs="Calibri" w:asciiTheme="minorAscii" w:hAnsiTheme="minorAscii" w:eastAsiaTheme="minorAscii" w:cstheme="minorAscii"/>
-          <w:sz w:val="22"/>
-          <w:szCs w:val="22"/>
-        </w:rPr>
-        <w:t xml:space="preserve"> new construction 55 - 60 bed hospitals</w:t>
-      </w:r>
-      <w:r>
-        <w:rPr>
-          <w:rFonts w:ascii="Calibri" w:hAnsi="Calibri" w:eastAsia="Calibri" w:cs="Calibri" w:asciiTheme="minorAscii" w:hAnsiTheme="minorAscii" w:eastAsiaTheme="minorAscii" w:cstheme="minorAscii"/>
-          <w:sz w:val="22"/>
-          <w:szCs w:val="22"/>
-        </w:rPr>
-        <w:t xml:space="preserve"> from SD to IFC with </w:t>
-      </w:r>
-      <w:r>
-        <w:rPr>
-          <w:rFonts w:ascii="Calibri" w:hAnsi="Calibri" w:eastAsia="Calibri" w:cs="Calibri" w:asciiTheme="minorAscii" w:hAnsiTheme="minorAscii" w:eastAsiaTheme="minorAscii" w:cstheme="minorAscii"/>
-          <w:sz w:val="22"/>
-          <w:szCs w:val="22"/>
-        </w:rPr>
-        <w:t xml:space="preserve">Chilled water, hot water and </w:t>
-      </w:r>
-      <w:r>
-        <w:rPr>
-          <w:rFonts w:ascii="Calibri" w:hAnsi="Calibri" w:eastAsia="Calibri" w:cs="Calibri" w:asciiTheme="minorAscii" w:hAnsiTheme="minorAscii" w:eastAsiaTheme="minorAscii" w:cstheme="minorAscii"/>
-          <w:sz w:val="22"/>
-          <w:szCs w:val="22"/>
-        </w:rPr>
-        <w:t>CAV</w:t>
-      </w:r>
-      <w:r>
-        <w:rPr>
-          <w:rFonts w:ascii="Calibri" w:hAnsi="Calibri" w:eastAsia="Calibri" w:cs="Calibri" w:asciiTheme="minorAscii" w:hAnsiTheme="minorAscii" w:eastAsiaTheme="minorAscii" w:cstheme="minorAscii"/>
-          <w:sz w:val="22"/>
-          <w:szCs w:val="22"/>
-        </w:rPr>
-        <w:t xml:space="preserve"> </w:t>
-      </w:r>
-      <w:r>
-        <w:rPr>
-          <w:rFonts w:ascii="Calibri" w:hAnsi="Calibri" w:eastAsia="Calibri" w:cs="Calibri" w:asciiTheme="minorAscii" w:hAnsiTheme="minorAscii" w:eastAsiaTheme="minorAscii" w:cstheme="minorAscii"/>
-          <w:sz w:val="22"/>
-          <w:szCs w:val="22"/>
-        </w:rPr>
-        <w:t>systems</w:t>
-      </w:r>
-      <w:r>
-        <w:rPr>
-          <w:rFonts w:ascii="Calibri" w:hAnsi="Calibri" w:eastAsia="Calibri" w:cs="Calibri" w:asciiTheme="minorAscii" w:hAnsiTheme="minorAscii" w:eastAsiaTheme="minorAscii" w:cstheme="minorAscii"/>
-          <w:sz w:val="22"/>
-          <w:szCs w:val="22"/>
-        </w:rPr>
-        <w:t>.</w:t>
-      </w:r>
-      <w:r>
-        <w:rPr>
-          <w:rFonts w:ascii="Calibri" w:hAnsi="Calibri" w:eastAsia="Calibri" w:cs="Calibri" w:asciiTheme="minorAscii" w:hAnsiTheme="minorAscii" w:eastAsiaTheme="minorAscii" w:cstheme="minorAscii"/>
-          <w:sz w:val="22"/>
-          <w:szCs w:val="22"/>
-        </w:rPr>
-        <w:t xml:space="preserve"> </w:t>
+          <w:sz w:val="22"/>
+          <w:szCs w:val="22"/>
+        </w:rPr>
+      </w:pPr>
+      <w:r>
+        <w:rPr>
+          <w:rFonts w:ascii="Calibri" w:hAnsi="Calibri" w:eastAsia="Calibri" w:cs="Calibri"/>
+          <w:noProof w:val="0"/>
+          <w:sz w:val="22"/>
+          <w:szCs w:val="22"/>
+          <w:lang w:val="en-IN"/>
+        </w:rPr>
+        <w:t>Worked on new construction special-purpose buildings, including server rooms (</w:t>
+      </w:r>
+      <w:r>
+        <w:rPr>
+          <w:rFonts w:ascii="Calibri" w:hAnsi="Calibri" w:eastAsia="Calibri" w:cs="Calibri"/>
+          <w:b w:val="1"/>
+          <w:bCs w:val="1"/>
+          <w:noProof w:val="0"/>
+          <w:sz w:val="22"/>
+          <w:szCs w:val="22"/>
+          <w:lang w:val="en-IN"/>
+        </w:rPr>
+        <w:t>up to 30 kW per rack</w:t>
+      </w:r>
+      <w:r>
+        <w:rPr>
+          <w:rFonts w:ascii="Calibri" w:hAnsi="Calibri" w:eastAsia="Calibri" w:cs="Calibri"/>
+          <w:noProof w:val="0"/>
+          <w:sz w:val="22"/>
+          <w:szCs w:val="22"/>
+          <w:lang w:val="en-IN"/>
+        </w:rPr>
+        <w:t>) from SD to IFC, with chilled water in-row CRAC units, DX CRAC systems with reheat and humidification, using hot aisle/cold aisle design.</w:t>
       </w:r>
     </w:p>
     <w:p>
@@ -2554,7 +2692,6 @@
           <w:color w:val="000000" w:themeColor="text1"/>
         </w:rPr>
       </w:pPr>
-      <w:bookmarkStart w:name="_Int_Pl725e6F" w:id="910631575"/>
       <w:r>
         <w:rPr>
           <w:rFonts w:ascii="Calibri" w:hAnsi="Calibri" w:cs="Calibri" w:asciiTheme="minorAscii" w:hAnsiTheme="minorAscii" w:cstheme="minorAscii"/>
@@ -2573,7 +2710,6 @@
         </w:rPr>
         <w:t xml:space="preserve"> in Mechanical Engineering</w:t>
       </w:r>
-      <w:bookmarkEnd w:id="910631575"/>
       <w:r>
         <w:rPr>
           <w:rFonts w:ascii="Calibri" w:hAnsi="Calibri" w:cs="Calibri" w:asciiTheme="minorAscii" w:hAnsiTheme="minorAscii" w:cstheme="minorAscii"/>
@@ -2668,7 +2804,7 @@
           <w:numId w:val="13"/>
         </w:numPr>
         <w:rPr>
-          <w:rFonts w:asciiTheme="minorHAnsi" w:hAnsiTheme="minorHAnsi" w:cstheme="minorHAnsi"/>
+          <w:rFonts w:ascii="Calibri" w:hAnsi="Calibri" w:cs="Calibri" w:asciiTheme="minorAscii" w:hAnsiTheme="minorAscii" w:cstheme="minorAscii"/>
           <w:color w:val="000000" w:themeColor="text1"/>
           <w:sz w:val="22"/>
           <w:szCs w:val="22"/>
@@ -2677,8 +2813,8 @@
       <w:bookmarkStart w:name="_Hlk512462530" w:id="1"/>
       <w:r>
         <w:rPr>
-          <w:rFonts w:asciiTheme="minorHAnsi" w:hAnsiTheme="minorHAnsi" w:cstheme="minorHAnsi"/>
-          <w:color w:val="000000" w:themeColor="text1"/>
+          <w:rFonts w:ascii="Calibri" w:hAnsi="Calibri" w:cs="Calibri" w:asciiTheme="minorAscii" w:hAnsiTheme="minorAscii" w:cstheme="minorAscii"/>
+          <w:color w:val="000000" w:themeColor="text1" w:themeTint="FF" w:themeShade="FF"/>
           <w:sz w:val="22"/>
           <w:szCs w:val="22"/>
         </w:rPr>
@@ -2686,8 +2822,8 @@
       </w:r>
       <w:r>
         <w:rPr>
-          <w:rFonts w:asciiTheme="minorHAnsi" w:hAnsiTheme="minorHAnsi" w:cstheme="minorHAnsi"/>
-          <w:color w:val="000000" w:themeColor="text1"/>
+          <w:rFonts w:ascii="Calibri" w:hAnsi="Calibri" w:cs="Calibri" w:asciiTheme="minorAscii" w:hAnsiTheme="minorAscii" w:cstheme="minorAscii"/>
+          <w:color w:val="000000" w:themeColor="text1" w:themeTint="FF" w:themeShade="FF"/>
           <w:sz w:val="22"/>
           <w:szCs w:val="22"/>
         </w:rPr>
@@ -2695,8 +2831,8 @@
       </w:r>
       <w:r>
         <w:rPr>
-          <w:rFonts w:asciiTheme="minorHAnsi" w:hAnsiTheme="minorHAnsi" w:cstheme="minorHAnsi"/>
-          <w:color w:val="000000" w:themeColor="text1"/>
+          <w:rFonts w:ascii="Calibri" w:hAnsi="Calibri" w:cs="Calibri" w:asciiTheme="minorAscii" w:hAnsiTheme="minorAscii" w:cstheme="minorAscii"/>
+          <w:color w:val="000000" w:themeColor="text1" w:themeTint="FF" w:themeShade="FF"/>
           <w:sz w:val="22"/>
           <w:szCs w:val="22"/>
         </w:rPr>
@@ -2704,8 +2840,8 @@
       </w:r>
       <w:r>
         <w:rPr>
-          <w:rFonts w:asciiTheme="minorHAnsi" w:hAnsiTheme="minorHAnsi" w:cstheme="minorHAnsi"/>
-          <w:color w:val="000000" w:themeColor="text1"/>
+          <w:rFonts w:ascii="Calibri" w:hAnsi="Calibri" w:cs="Calibri" w:asciiTheme="minorAscii" w:hAnsiTheme="minorAscii" w:cstheme="minorAscii"/>
+          <w:color w:val="000000" w:themeColor="text1" w:themeTint="FF" w:themeShade="FF"/>
           <w:sz w:val="22"/>
           <w:szCs w:val="22"/>
         </w:rPr>
@@ -2713,8 +2849,8 @@
       </w:r>
       <w:r>
         <w:rPr>
-          <w:rFonts w:asciiTheme="minorHAnsi" w:hAnsiTheme="minorHAnsi" w:cstheme="minorHAnsi"/>
-          <w:color w:val="000000" w:themeColor="text1"/>
+          <w:rFonts w:ascii="Calibri" w:hAnsi="Calibri" w:cs="Calibri" w:asciiTheme="minorAscii" w:hAnsiTheme="minorAscii" w:cstheme="minorAscii"/>
+          <w:color w:val="000000" w:themeColor="text1" w:themeTint="FF" w:themeShade="FF"/>
           <w:sz w:val="22"/>
           <w:szCs w:val="22"/>
         </w:rPr>
@@ -2722,8 +2858,8 @@
       </w:r>
       <w:r>
         <w:rPr>
-          <w:rFonts w:asciiTheme="minorHAnsi" w:hAnsiTheme="minorHAnsi" w:cstheme="minorHAnsi"/>
-          <w:color w:val="000000" w:themeColor="text1"/>
+          <w:rFonts w:ascii="Calibri" w:hAnsi="Calibri" w:cs="Calibri" w:asciiTheme="minorAscii" w:hAnsiTheme="minorAscii" w:cstheme="minorAscii"/>
+          <w:color w:val="000000" w:themeColor="text1" w:themeTint="FF" w:themeShade="FF"/>
           <w:sz w:val="22"/>
           <w:szCs w:val="22"/>
         </w:rPr>
@@ -2731,8 +2867,8 @@
       </w:r>
       <w:r>
         <w:rPr>
-          <w:rFonts w:asciiTheme="minorHAnsi" w:hAnsiTheme="minorHAnsi" w:cstheme="minorHAnsi"/>
-          <w:color w:val="000000" w:themeColor="text1"/>
+          <w:rFonts w:ascii="Calibri" w:hAnsi="Calibri" w:cs="Calibri" w:asciiTheme="minorAscii" w:hAnsiTheme="minorAscii" w:cstheme="minorAscii"/>
+          <w:color w:val="000000" w:themeColor="text1" w:themeTint="FF" w:themeShade="FF"/>
           <w:sz w:val="22"/>
           <w:szCs w:val="22"/>
         </w:rPr>
@@ -2740,8 +2876,8 @@
       </w:r>
       <w:r>
         <w:rPr>
-          <w:rFonts w:asciiTheme="minorHAnsi" w:hAnsiTheme="minorHAnsi" w:cstheme="minorHAnsi"/>
-          <w:color w:val="000000" w:themeColor="text1"/>
+          <w:rFonts w:ascii="Calibri" w:hAnsi="Calibri" w:cs="Calibri" w:asciiTheme="minorAscii" w:hAnsiTheme="minorAscii" w:cstheme="minorAscii"/>
+          <w:color w:val="000000" w:themeColor="text1" w:themeTint="FF" w:themeShade="FF"/>
           <w:sz w:val="22"/>
           <w:szCs w:val="22"/>
         </w:rPr>
@@ -2749,12 +2885,30 @@
       </w:r>
       <w:r>
         <w:rPr>
-          <w:rFonts w:asciiTheme="minorHAnsi" w:hAnsiTheme="minorHAnsi" w:cstheme="minorHAnsi"/>
-          <w:color w:val="000000" w:themeColor="text1"/>
-          <w:sz w:val="22"/>
-          <w:szCs w:val="22"/>
-        </w:rPr>
-        <w:t>.</w:t>
+          <w:rFonts w:ascii="Calibri" w:hAnsi="Calibri" w:cs="Calibri" w:asciiTheme="minorAscii" w:hAnsiTheme="minorAscii" w:cstheme="minorAscii"/>
+          <w:color w:val="000000" w:themeColor="text1" w:themeTint="FF" w:themeShade="FF"/>
+          <w:sz w:val="22"/>
+          <w:szCs w:val="22"/>
+        </w:rPr>
+        <w:t>,</w:t>
+      </w:r>
+      <w:r>
+        <w:rPr>
+          <w:rFonts w:ascii="Calibri" w:hAnsi="Calibri" w:cs="Calibri" w:asciiTheme="minorAscii" w:hAnsiTheme="minorAscii" w:cstheme="minorAscii"/>
+          <w:color w:val="000000" w:themeColor="text1" w:themeTint="FF" w:themeShade="FF"/>
+          <w:sz w:val="22"/>
+          <w:szCs w:val="22"/>
+        </w:rPr>
+        <w:t xml:space="preserve"> </w:t>
+      </w:r>
+      <w:r>
+        <w:rPr>
+          <w:rFonts w:ascii="Calibri" w:hAnsi="Calibri" w:cs="Calibri" w:asciiTheme="minorAscii" w:hAnsiTheme="minorAscii" w:cstheme="minorAscii"/>
+          <w:color w:val="000000" w:themeColor="text1" w:themeTint="FF" w:themeShade="FF"/>
+          <w:sz w:val="22"/>
+          <w:szCs w:val="22"/>
+        </w:rPr>
+        <w:t>Solid Mechanical</w:t>
       </w:r>
     </w:p>
     <w:p>
@@ -2770,7 +2924,6 @@
       </w:pPr>
       <w:bookmarkStart w:name="_Hlk512462560" w:id="2"/>
       <w:bookmarkEnd w:id="1"/>
-      <w:bookmarkStart w:name="_Int_ZoxwCJkY" w:id="251482338"/>
       <w:r>
         <w:rPr>
           <w:rFonts w:ascii="Calibri" w:hAnsi="Calibri" w:cs="Calibri" w:asciiTheme="minorAscii" w:hAnsiTheme="minorAscii" w:cstheme="minorAscii"/>
@@ -2798,7 +2951,6 @@
         </w:rPr>
         <w:t>g</w:t>
       </w:r>
-      <w:bookmarkEnd w:id="251482338"/>
       <w:r>
         <w:rPr>
           <w:rFonts w:ascii="Calibri" w:hAnsi="Calibri" w:cs="Calibri" w:asciiTheme="minorAscii" w:hAnsiTheme="minorAscii" w:cstheme="minorAscii"/>
@@ -3381,7 +3533,7 @@
           <w:szCs w:val="24"/>
           <w:u w:val="none"/>
         </w:rPr>
-        <w:t>OFFICE APPS</w:t>
+        <w:t>GD&amp;T</w:t>
       </w:r>
       <w:r>
         <w:rPr>
@@ -3511,7 +3663,47 @@
           <w:szCs w:val="24"/>
           <w:u w:val="none"/>
         </w:rPr>
-        <w:t xml:space="preserve"> │ MICROSOFT PROJECT </w:t>
+        <w:t xml:space="preserve"> │ </w:t>
+      </w:r>
+      <w:r>
+        <w:rPr>
+          <w:rFonts w:ascii="Calibri" w:hAnsi="Calibri" w:eastAsia="Times New Roman" w:cs="Calibri" w:asciiTheme="minorAscii" w:hAnsiTheme="minorAscii" w:cstheme="minorAscii"/>
+          <w:color w:val="000000" w:themeColor="text1" w:themeTint="FF" w:themeShade="FF"/>
+          <w:sz w:val="24"/>
+          <w:szCs w:val="24"/>
+          <w:u w:val="none"/>
+        </w:rPr>
+        <w:t>ASHRAE 90.4</w:t>
+      </w:r>
+      <w:r>
+        <w:rPr>
+          <w:rFonts w:ascii="Calibri" w:hAnsi="Calibri" w:eastAsia="Times New Roman" w:cs="Calibri" w:asciiTheme="minorAscii" w:hAnsiTheme="minorAscii" w:cstheme="minorAscii"/>
+          <w:color w:val="000000" w:themeColor="text1" w:themeTint="FF" w:themeShade="FF"/>
+          <w:sz w:val="24"/>
+          <w:szCs w:val="24"/>
+          <w:u w:val="none"/>
+        </w:rPr>
+        <w:t xml:space="preserve"> ENERGY STD DATA CENTERS</w:t>
+      </w:r>
+      <w:r>
+        <w:rPr>
+          <w:rFonts w:ascii="Calibri" w:hAnsi="Calibri" w:eastAsia="Times New Roman" w:cs="Calibri" w:asciiTheme="minorAscii" w:hAnsiTheme="minorAscii" w:cstheme="minorAscii"/>
+          <w:color w:val="000000" w:themeColor="text1" w:themeTint="FF" w:themeShade="FF"/>
+          <w:sz w:val="24"/>
+          <w:szCs w:val="24"/>
+          <w:u w:val="none"/>
+        </w:rPr>
+        <w:t xml:space="preserve"> </w:t>
+      </w:r>
+      <w:r>
+        <w:rPr>
+          <w:rFonts w:ascii="Calibri" w:hAnsi="Calibri" w:eastAsia="Times New Roman" w:cs="Calibri" w:asciiTheme="minorAscii" w:hAnsiTheme="minorAscii" w:cstheme="minorAscii"/>
+          <w:color w:val="000000" w:themeColor="text1" w:themeTint="FF" w:themeShade="FF"/>
+          <w:sz w:val="24"/>
+          <w:szCs w:val="24"/>
+          <w:u w:val="none"/>
+        </w:rPr>
+        <w:t>│ ENERGY PLUS │ TRACE 3D</w:t>
       </w:r>
     </w:p>
     <w:sectPr>
@@ -3592,11 +3784,8 @@
     <int2:textHash int2:hashCode="FksjaCdRv7uOQx" int2:id="BDn6zXTI">
       <int2:state int2:type="LegacyProofing" int2:value="Rejected"/>
     </int2:textHash>
-    <int2:bookmark int2:bookmarkName="_Int_ZoxwCJkY" int2:invalidationBookmarkName="" int2:hashCode="y0TxdMkaUypFZd" int2:id="D4NGuhW9">
-      <int2:state int2:type="AugLoop_Text_Critique" int2:value="Rejected"/>
-    </int2:bookmark>
-    <int2:bookmark int2:bookmarkName="_Int_Pl725e6F" int2:invalidationBookmarkName="" int2:hashCode="AbSCXABokbGIKG" int2:id="cQBKfvUD">
-      <int2:state int2:type="AugLoop_Text_Critique" int2:value="Rejected"/>
+    <int2:bookmark int2:bookmarkName="_Int_gSiU9BDT" int2:invalidationBookmarkName="" int2:hashCode="GAkgqxg8Cn+3qD" int2:id="aV9DtIsG">
+      <int2:state int2:type="LegacyProofing" int2:value="Rejected"/>
     </int2:bookmark>
   </int2:observations>
   <int2:intelligenceSettings/>

</xml_diff>